<commit_message>
repo rename follow-up cleanup
change documentation where the main repo (hatpro-schema-temp) has been renamed (hatpro-schema-htwg
</commit_message>
<xml_diff>
--- a/docs/GitHub/GIT-CLI-CheatSheet.docx
+++ b/docs/GitHub/GIT-CLI-CheatSheet.docx
@@ -234,7 +234,7 @@
                 <w:b/>
                 <w:noProof/>
               </w:rPr>
-              <w:t>2026-05-11 10:03:00</w:t>
+              <w:t>2026-05-19 14:02:00</w:t>
             </w:r>
             <w:r>
               <w:rPr>
@@ -525,9 +525,9 @@
             </w:pPr>
             <w:smartTag w:uri="urn:schemas-microsoft-com:office:smarttags" w:element="date">
               <w:smartTagPr>
+                <w:attr w:name="Month" w:val="12"/>
+                <w:attr w:name="Day" w:val="8"/>
                 <w:attr w:name="Year" w:val="2004"/>
-                <w:attr w:name="Day" w:val="8"/>
-                <w:attr w:name="Month" w:val="12"/>
               </w:smartTagPr>
               <w:r>
                 <w:t>08Dec2004</w:t>
@@ -16050,7 +16050,19 @@
         <w:pStyle w:val="HTMLPreformatted"/>
       </w:pPr>
       <w:r>
-        <w:t>C:\Users\nthomson\Projects\hatpro-schema-temp_RECONCILE\.git\</w:t>
+        <w:t>C:\Users\nthomson\Projects\hatpro-schema-</w:t>
+      </w:r>
+      <w:r>
+        <w:t>htwg</w:t>
+      </w:r>
+      <w:r>
+        <w:t>_</w:t>
+      </w:r>
+      <w:r>
+        <w:t>branch</w:t>
+      </w:r>
+      <w:r>
+        <w:t>\.git\</w:t>
       </w:r>
     </w:p>
     <w:p>
@@ -16162,7 +16174,19 @@
         <w:pStyle w:val="HTMLPreformatted"/>
       </w:pPr>
       <w:r>
-        <w:t>hatpro-schema-temp_RECONCILE\</w:t>
+        <w:t>hatpro-schema-</w:t>
+      </w:r>
+      <w:r>
+        <w:t>htwg</w:t>
+      </w:r>
+      <w:r>
+        <w:t>_</w:t>
+      </w:r>
+      <w:r>
+        <w:t>branch</w:t>
+      </w:r>
+      <w:r>
+        <w:t>\</w:t>
       </w:r>
       <w:r>
         <w:br/>
@@ -16222,7 +16246,13 @@
         <w:pStyle w:val="HTMLPreformatted"/>
       </w:pPr>
       <w:r>
-        <w:t>hatpro-schema-temp_RECONCILE\.git\</w:t>
+        <w:t>hatpro-schema</w:t>
+      </w:r>
+      <w:r>
+        <w:t>-htwg_branch</w:t>
+      </w:r>
+      <w:r>
+        <w:t>\.git\</w:t>
       </w:r>
     </w:p>
     <w:p>
@@ -16261,7 +16291,10 @@
         <w:pStyle w:val="HTMLPreformatted"/>
       </w:pPr>
       <w:r>
-        <w:t>https://github.com/decentralized-identity/hatpro-schema-temp</w:t>
+        <w:t>https://github.com/decentralized-identity/hatpro-schema-</w:t>
+      </w:r>
+      <w:r>
+        <w:t>htwg</w:t>
       </w:r>
     </w:p>
     <w:p>
@@ -19518,16 +19551,7 @@
         <w:t>git clean</w:t>
       </w:r>
       <w:r>
-        <w:t xml:space="preserve"> removes local untracked/ignored files from </w:t>
-      </w:r>
-      <w:r>
-        <w:t xml:space="preserve">(local) </w:t>
-      </w:r>
-      <w:r>
-        <w:t>disk</w:t>
-      </w:r>
-      <w:r>
-        <w:t xml:space="preserve"> </w:t>
+        <w:t xml:space="preserve"> removes local untracked/ignored files from (local) disk </w:t>
       </w:r>
     </w:p>
     <w:p>
@@ -20573,7 +20597,7 @@
       <w:rPr>
         <w:noProof/>
       </w:rPr>
-      <w:t>2026-05-11 10:03:00</w:t>
+      <w:t>2026-05-19 14:02:00</w:t>
     </w:r>
     <w:r>
       <w:fldChar w:fldCharType="end"/>

</xml_diff>